<commit_message>
Fixed typo and redundant repo link
</commit_message>
<xml_diff>
--- a/Schema Project Overview & Usage.docx
+++ b/Schema Project Overview & Usage.docx
@@ -120,6 +120,9 @@
     </w:p>
     <w:p>
       <w:r>
+        <w:rPr>
+          <w:noProof/>
+        </w:rPr>
         <w:drawing>
           <wp:inline distT="0" distB="0" distL="0" distR="0" wp14:anchorId="204C4063" wp14:editId="44BDE6BF">
             <wp:extent cx="5943600" cy="3363595"/>
@@ -330,6 +333,9 @@
     </w:p>
     <w:p>
       <w:r>
+        <w:rPr>
+          <w:noProof/>
+        </w:rPr>
         <w:drawing>
           <wp:inline distT="0" distB="0" distL="0" distR="0" wp14:anchorId="69ACF637" wp14:editId="52FEADA5">
             <wp:extent cx="5943600" cy="3265805"/>
@@ -412,6 +418,9 @@
     </w:p>
     <w:p>
       <w:r>
+        <w:rPr>
+          <w:noProof/>
+        </w:rPr>
         <w:drawing>
           <wp:inline distT="0" distB="0" distL="0" distR="0" wp14:anchorId="40636230" wp14:editId="40C91256">
             <wp:extent cx="5943600" cy="2759075"/>
@@ -518,6 +527,9 @@
     </w:p>
     <w:p>
       <w:r>
+        <w:rPr>
+          <w:noProof/>
+        </w:rPr>
         <w:drawing>
           <wp:inline distT="0" distB="0" distL="0" distR="0" wp14:anchorId="17EEFF89" wp14:editId="0C106095">
             <wp:extent cx="5943600" cy="2844800"/>
@@ -598,6 +610,9 @@
     </w:p>
     <w:p>
       <w:r>
+        <w:rPr>
+          <w:noProof/>
+        </w:rPr>
         <w:drawing>
           <wp:inline distT="0" distB="0" distL="0" distR="0" wp14:anchorId="4E7CC6DB" wp14:editId="3488A09C">
             <wp:extent cx="5943600" cy="2663190"/>
@@ -643,15 +658,13 @@
         <w:t>all</w:t>
       </w:r>
       <w:r>
-        <w:t xml:space="preserve"> the object relations established through the program usage. </w:t>
-      </w:r>
-      <w:proofErr w:type="spellStart"/>
-      <w:r>
-        <w:t>Scema</w:t>
-      </w:r>
-      <w:proofErr w:type="spellEnd"/>
-      <w:r>
-        <w:t xml:space="preserve"> Clone has a </w:t>
+        <w:t xml:space="preserve"> the object relations established through the program usage. Sc</w:t>
+      </w:r>
+      <w:r>
+        <w:t>h</w:t>
+      </w:r>
+      <w:r>
+        <w:t xml:space="preserve">ema Clone has a </w:t>
       </w:r>
       <w:proofErr w:type="spellStart"/>
       <w:r>
@@ -714,6 +727,9 @@
     </w:p>
     <w:p>
       <w:r>
+        <w:rPr>
+          <w:noProof/>
+        </w:rPr>
         <w:drawing>
           <wp:inline distT="0" distB="0" distL="0" distR="0" wp14:anchorId="2049A5FB" wp14:editId="296E4435">
             <wp:extent cx="5943600" cy="5866130"/>
@@ -817,10 +833,7 @@
       <w:proofErr w:type="spellStart"/>
       <w:proofErr w:type="gramEnd"/>
       <w:r>
-        <w:t>SchemaEligible</w:t>
-      </w:r>
-      <w:r>
-        <w:t>.class</w:t>
+        <w:t>SchemaEligible.class</w:t>
       </w:r>
       <w:proofErr w:type="spellEnd"/>
       <w:r>
@@ -1474,7 +1487,15 @@
     </w:p>
     <w:p>
       <w:r>
-        <w:t xml:space="preserve">                Type containerArg = </w:t>
+        <w:t xml:space="preserve">                Type </w:t>
+      </w:r>
+      <w:proofErr w:type="spellStart"/>
+      <w:r>
+        <w:t>containerArg</w:t>
+      </w:r>
+      <w:proofErr w:type="spellEnd"/>
+      <w:r>
+        <w:t xml:space="preserve"> = </w:t>
       </w:r>
       <w:proofErr w:type="spellStart"/>
       <w:r>
@@ -1513,7 +1534,15 @@
     </w:p>
     <w:p>
       <w:r>
-        <w:t xml:space="preserve">                String ArgName = </w:t>
+        <w:t xml:space="preserve">                String </w:t>
+      </w:r>
+      <w:proofErr w:type="spellStart"/>
+      <w:r>
+        <w:t>ArgName</w:t>
+      </w:r>
+      <w:proofErr w:type="spellEnd"/>
+      <w:r>
+        <w:t xml:space="preserve"> = </w:t>
       </w:r>
       <w:proofErr w:type="spellStart"/>
       <w:r>
@@ -1673,26 +1702,6 @@
       <w:r>
         <w:t xml:space="preserve"> display proper. </w:t>
       </w:r>
-    </w:p>
-    <w:p/>
-    <w:p/>
-    <w:p>
-      <w:proofErr w:type="spellStart"/>
-      <w:r>
-        <w:t>Github</w:t>
-      </w:r>
-      <w:proofErr w:type="spellEnd"/>
-      <w:r>
-        <w:t xml:space="preserve"> Repo: </w:t>
-      </w:r>
-      <w:hyperlink r:id="rId10" w:history="1">
-        <w:r>
-          <w:rPr>
-            <w:rStyle w:val="Hyperlink"/>
-          </w:rPr>
-          <w:t>unocsci2830/csci-2830-final-project-Colphon: unocsci2830sp26-csci-2830-final-project-testautograde created by GitHub Classroom</w:t>
-        </w:r>
-      </w:hyperlink>
     </w:p>
     <w:sectPr>
       <w:pgSz w:w="12240" w:h="15840"/>
@@ -2307,6 +2316,7 @@
   <w:style w:type="character" w:default="1" w:styleId="DefaultParagraphFont">
     <w:name w:val="Default Paragraph Font"/>
     <w:uiPriority w:val="1"/>
+    <w:semiHidden/>
     <w:unhideWhenUsed/>
   </w:style>
   <w:style w:type="table" w:default="1" w:styleId="TableNormal">

</xml_diff>